<commit_message>
added validation folder - dm-k1 docs
</commit_message>
<xml_diff>
--- a/BGIL_DBT/validation/DM-K1.docx
+++ b/BGIL_DBT/validation/DM-K1.docx
@@ -460,75 +460,6 @@
           </w:p>
         </w:tc>
       </w:tr>
-      <w:tr>
-        <w:tc>
-          <w:tcPr>
-            <w:tcW w:type="dxa" w:w="4320"/>
-          </w:tcPr>
-          <w:p>
-            <w:r>
-              <w:rPr>
-                <w:b/>
-              </w:rPr>
-              <w:t>Executed by</w:t>
-            </w:r>
-          </w:p>
-        </w:tc>
-        <w:tc>
-          <w:tcPr>
-            <w:tcW w:type="dxa" w:w="4320"/>
-          </w:tcPr>
-          <w:p>
-            <w:r/>
-          </w:p>
-        </w:tc>
-      </w:tr>
-      <w:tr>
-        <w:tc>
-          <w:tcPr>
-            <w:tcW w:type="dxa" w:w="4320"/>
-          </w:tcPr>
-          <w:p>
-            <w:r>
-              <w:rPr>
-                <w:b/>
-              </w:rPr>
-              <w:t>Executed on (date)</w:t>
-            </w:r>
-          </w:p>
-        </w:tc>
-        <w:tc>
-          <w:tcPr>
-            <w:tcW w:type="dxa" w:w="4320"/>
-          </w:tcPr>
-          <w:p>
-            <w:r/>
-          </w:p>
-        </w:tc>
-      </w:tr>
-      <w:tr>
-        <w:tc>
-          <w:tcPr>
-            <w:tcW w:type="dxa" w:w="4320"/>
-          </w:tcPr>
-          <w:p>
-            <w:r>
-              <w:rPr>
-                <w:b/>
-              </w:rPr>
-              <w:t>Evidence reference</w:t>
-            </w:r>
-          </w:p>
-        </w:tc>
-        <w:tc>
-          <w:tcPr>
-            <w:tcW w:type="dxa" w:w="4320"/>
-          </w:tcPr>
-          <w:p>
-            <w:r/>
-          </w:p>
-        </w:tc>
-      </w:tr>
     </w:tbl>
     <w:p/>
     <w:p>
@@ -674,7 +605,6 @@
             <w:tcW w:type="dxa" w:w="8640"/>
           </w:tcPr>
           <w:p>
-            <w:r/>
             <w:r>
               <w:br/>
               <w:br/>
@@ -849,75 +779,6 @@
           </w:p>
         </w:tc>
       </w:tr>
-      <w:tr>
-        <w:tc>
-          <w:tcPr>
-            <w:tcW w:type="dxa" w:w="4320"/>
-          </w:tcPr>
-          <w:p>
-            <w:r>
-              <w:rPr>
-                <w:b/>
-              </w:rPr>
-              <w:t>Executed by</w:t>
-            </w:r>
-          </w:p>
-        </w:tc>
-        <w:tc>
-          <w:tcPr>
-            <w:tcW w:type="dxa" w:w="4320"/>
-          </w:tcPr>
-          <w:p>
-            <w:r/>
-          </w:p>
-        </w:tc>
-      </w:tr>
-      <w:tr>
-        <w:tc>
-          <w:tcPr>
-            <w:tcW w:type="dxa" w:w="4320"/>
-          </w:tcPr>
-          <w:p>
-            <w:r>
-              <w:rPr>
-                <w:b/>
-              </w:rPr>
-              <w:t>Executed on (date)</w:t>
-            </w:r>
-          </w:p>
-        </w:tc>
-        <w:tc>
-          <w:tcPr>
-            <w:tcW w:type="dxa" w:w="4320"/>
-          </w:tcPr>
-          <w:p>
-            <w:r/>
-          </w:p>
-        </w:tc>
-      </w:tr>
-      <w:tr>
-        <w:tc>
-          <w:tcPr>
-            <w:tcW w:type="dxa" w:w="4320"/>
-          </w:tcPr>
-          <w:p>
-            <w:r>
-              <w:rPr>
-                <w:b/>
-              </w:rPr>
-              <w:t>Evidence reference</w:t>
-            </w:r>
-          </w:p>
-        </w:tc>
-        <w:tc>
-          <w:tcPr>
-            <w:tcW w:type="dxa" w:w="4320"/>
-          </w:tcPr>
-          <w:p>
-            <w:r/>
-          </w:p>
-        </w:tc>
-      </w:tr>
     </w:tbl>
     <w:p/>
     <w:p>
@@ -1015,7 +876,6 @@
             <w:tcW w:type="dxa" w:w="8640"/>
           </w:tcPr>
           <w:p>
-            <w:r/>
             <w:r>
               <w:br/>
               <w:br/>
@@ -1178,75 +1038,6 @@
                 <w:b/>
               </w:rPr>
               <w:t>Rows returned (count)</w:t>
-            </w:r>
-          </w:p>
-        </w:tc>
-        <w:tc>
-          <w:tcPr>
-            <w:tcW w:type="dxa" w:w="4320"/>
-          </w:tcPr>
-          <w:p>
-            <w:r/>
-          </w:p>
-        </w:tc>
-      </w:tr>
-      <w:tr>
-        <w:tc>
-          <w:tcPr>
-            <w:tcW w:type="dxa" w:w="4320"/>
-          </w:tcPr>
-          <w:p>
-            <w:r>
-              <w:rPr>
-                <w:b/>
-              </w:rPr>
-              <w:t>Executed by</w:t>
-            </w:r>
-          </w:p>
-        </w:tc>
-        <w:tc>
-          <w:tcPr>
-            <w:tcW w:type="dxa" w:w="4320"/>
-          </w:tcPr>
-          <w:p>
-            <w:r/>
-          </w:p>
-        </w:tc>
-      </w:tr>
-      <w:tr>
-        <w:tc>
-          <w:tcPr>
-            <w:tcW w:type="dxa" w:w="4320"/>
-          </w:tcPr>
-          <w:p>
-            <w:r>
-              <w:rPr>
-                <w:b/>
-              </w:rPr>
-              <w:t>Executed on (date)</w:t>
-            </w:r>
-          </w:p>
-        </w:tc>
-        <w:tc>
-          <w:tcPr>
-            <w:tcW w:type="dxa" w:w="4320"/>
-          </w:tcPr>
-          <w:p>
-            <w:r/>
-          </w:p>
-        </w:tc>
-      </w:tr>
-      <w:tr>
-        <w:tc>
-          <w:tcPr>
-            <w:tcW w:type="dxa" w:w="4320"/>
-          </w:tcPr>
-          <w:p>
-            <w:r>
-              <w:rPr>
-                <w:b/>
-              </w:rPr>
-              <w:t>Evidence reference</w:t>
             </w:r>
           </w:p>
         </w:tc>
@@ -1323,7 +1114,6 @@
             <w:tcW w:type="dxa" w:w="8640"/>
           </w:tcPr>
           <w:p>
-            <w:r/>
             <w:r>
               <w:br/>
               <w:br/>
@@ -1498,75 +1288,6 @@
           </w:p>
         </w:tc>
       </w:tr>
-      <w:tr>
-        <w:tc>
-          <w:tcPr>
-            <w:tcW w:type="dxa" w:w="4320"/>
-          </w:tcPr>
-          <w:p>
-            <w:r>
-              <w:rPr>
-                <w:b/>
-              </w:rPr>
-              <w:t>Executed by</w:t>
-            </w:r>
-          </w:p>
-        </w:tc>
-        <w:tc>
-          <w:tcPr>
-            <w:tcW w:type="dxa" w:w="4320"/>
-          </w:tcPr>
-          <w:p>
-            <w:r/>
-          </w:p>
-        </w:tc>
-      </w:tr>
-      <w:tr>
-        <w:tc>
-          <w:tcPr>
-            <w:tcW w:type="dxa" w:w="4320"/>
-          </w:tcPr>
-          <w:p>
-            <w:r>
-              <w:rPr>
-                <w:b/>
-              </w:rPr>
-              <w:t>Executed on (date)</w:t>
-            </w:r>
-          </w:p>
-        </w:tc>
-        <w:tc>
-          <w:tcPr>
-            <w:tcW w:type="dxa" w:w="4320"/>
-          </w:tcPr>
-          <w:p>
-            <w:r/>
-          </w:p>
-        </w:tc>
-      </w:tr>
-      <w:tr>
-        <w:tc>
-          <w:tcPr>
-            <w:tcW w:type="dxa" w:w="4320"/>
-          </w:tcPr>
-          <w:p>
-            <w:r>
-              <w:rPr>
-                <w:b/>
-              </w:rPr>
-              <w:t>Evidence reference</w:t>
-            </w:r>
-          </w:p>
-        </w:tc>
-        <w:tc>
-          <w:tcPr>
-            <w:tcW w:type="dxa" w:w="4320"/>
-          </w:tcPr>
-          <w:p>
-            <w:r/>
-          </w:p>
-        </w:tc>
-      </w:tr>
     </w:tbl>
     <w:p/>
     <w:p>
@@ -1664,7 +1385,6 @@
             <w:tcW w:type="dxa" w:w="8640"/>
           </w:tcPr>
           <w:p>
-            <w:r/>
             <w:r>
               <w:br/>
               <w:br/>
@@ -1839,75 +1559,6 @@
           </w:p>
         </w:tc>
       </w:tr>
-      <w:tr>
-        <w:tc>
-          <w:tcPr>
-            <w:tcW w:type="dxa" w:w="4320"/>
-          </w:tcPr>
-          <w:p>
-            <w:r>
-              <w:rPr>
-                <w:b/>
-              </w:rPr>
-              <w:t>Executed by</w:t>
-            </w:r>
-          </w:p>
-        </w:tc>
-        <w:tc>
-          <w:tcPr>
-            <w:tcW w:type="dxa" w:w="4320"/>
-          </w:tcPr>
-          <w:p>
-            <w:r/>
-          </w:p>
-        </w:tc>
-      </w:tr>
-      <w:tr>
-        <w:tc>
-          <w:tcPr>
-            <w:tcW w:type="dxa" w:w="4320"/>
-          </w:tcPr>
-          <w:p>
-            <w:r>
-              <w:rPr>
-                <w:b/>
-              </w:rPr>
-              <w:t>Executed on (date)</w:t>
-            </w:r>
-          </w:p>
-        </w:tc>
-        <w:tc>
-          <w:tcPr>
-            <w:tcW w:type="dxa" w:w="4320"/>
-          </w:tcPr>
-          <w:p>
-            <w:r/>
-          </w:p>
-        </w:tc>
-      </w:tr>
-      <w:tr>
-        <w:tc>
-          <w:tcPr>
-            <w:tcW w:type="dxa" w:w="4320"/>
-          </w:tcPr>
-          <w:p>
-            <w:r>
-              <w:rPr>
-                <w:b/>
-              </w:rPr>
-              <w:t>Evidence reference</w:t>
-            </w:r>
-          </w:p>
-        </w:tc>
-        <w:tc>
-          <w:tcPr>
-            <w:tcW w:type="dxa" w:w="4320"/>
-          </w:tcPr>
-          <w:p>
-            <w:r/>
-          </w:p>
-        </w:tc>
-      </w:tr>
     </w:tbl>
     <w:p/>
     <w:p>
@@ -2005,7 +1656,6 @@
             <w:tcW w:type="dxa" w:w="8640"/>
           </w:tcPr>
           <w:p>
-            <w:r/>
             <w:r>
               <w:br/>
               <w:br/>
@@ -2180,75 +1830,6 @@
           </w:p>
         </w:tc>
       </w:tr>
-      <w:tr>
-        <w:tc>
-          <w:tcPr>
-            <w:tcW w:type="dxa" w:w="4320"/>
-          </w:tcPr>
-          <w:p>
-            <w:r>
-              <w:rPr>
-                <w:b/>
-              </w:rPr>
-              <w:t>Executed by</w:t>
-            </w:r>
-          </w:p>
-        </w:tc>
-        <w:tc>
-          <w:tcPr>
-            <w:tcW w:type="dxa" w:w="4320"/>
-          </w:tcPr>
-          <w:p>
-            <w:r/>
-          </w:p>
-        </w:tc>
-      </w:tr>
-      <w:tr>
-        <w:tc>
-          <w:tcPr>
-            <w:tcW w:type="dxa" w:w="4320"/>
-          </w:tcPr>
-          <w:p>
-            <w:r>
-              <w:rPr>
-                <w:b/>
-              </w:rPr>
-              <w:t>Executed on (date)</w:t>
-            </w:r>
-          </w:p>
-        </w:tc>
-        <w:tc>
-          <w:tcPr>
-            <w:tcW w:type="dxa" w:w="4320"/>
-          </w:tcPr>
-          <w:p>
-            <w:r/>
-          </w:p>
-        </w:tc>
-      </w:tr>
-      <w:tr>
-        <w:tc>
-          <w:tcPr>
-            <w:tcW w:type="dxa" w:w="4320"/>
-          </w:tcPr>
-          <w:p>
-            <w:r>
-              <w:rPr>
-                <w:b/>
-              </w:rPr>
-              <w:t>Evidence reference</w:t>
-            </w:r>
-          </w:p>
-        </w:tc>
-        <w:tc>
-          <w:tcPr>
-            <w:tcW w:type="dxa" w:w="4320"/>
-          </w:tcPr>
-          <w:p>
-            <w:r/>
-          </w:p>
-        </w:tc>
-      </w:tr>
     </w:tbl>
     <w:p/>
     <w:p>
@@ -2346,7 +1927,6 @@
             <w:tcW w:type="dxa" w:w="8640"/>
           </w:tcPr>
           <w:p>
-            <w:r/>
             <w:r>
               <w:br/>
               <w:br/>
@@ -2521,75 +2101,6 @@
           </w:p>
         </w:tc>
       </w:tr>
-      <w:tr>
-        <w:tc>
-          <w:tcPr>
-            <w:tcW w:type="dxa" w:w="4320"/>
-          </w:tcPr>
-          <w:p>
-            <w:r>
-              <w:rPr>
-                <w:b/>
-              </w:rPr>
-              <w:t>Executed by</w:t>
-            </w:r>
-          </w:p>
-        </w:tc>
-        <w:tc>
-          <w:tcPr>
-            <w:tcW w:type="dxa" w:w="4320"/>
-          </w:tcPr>
-          <w:p>
-            <w:r/>
-          </w:p>
-        </w:tc>
-      </w:tr>
-      <w:tr>
-        <w:tc>
-          <w:tcPr>
-            <w:tcW w:type="dxa" w:w="4320"/>
-          </w:tcPr>
-          <w:p>
-            <w:r>
-              <w:rPr>
-                <w:b/>
-              </w:rPr>
-              <w:t>Executed on (date)</w:t>
-            </w:r>
-          </w:p>
-        </w:tc>
-        <w:tc>
-          <w:tcPr>
-            <w:tcW w:type="dxa" w:w="4320"/>
-          </w:tcPr>
-          <w:p>
-            <w:r/>
-          </w:p>
-        </w:tc>
-      </w:tr>
-      <w:tr>
-        <w:tc>
-          <w:tcPr>
-            <w:tcW w:type="dxa" w:w="4320"/>
-          </w:tcPr>
-          <w:p>
-            <w:r>
-              <w:rPr>
-                <w:b/>
-              </w:rPr>
-              <w:t>Evidence reference</w:t>
-            </w:r>
-          </w:p>
-        </w:tc>
-        <w:tc>
-          <w:tcPr>
-            <w:tcW w:type="dxa" w:w="4320"/>
-          </w:tcPr>
-          <w:p>
-            <w:r/>
-          </w:p>
-        </w:tc>
-      </w:tr>
     </w:tbl>
     <w:p/>
     <w:p>
@@ -2687,7 +2198,6 @@
             <w:tcW w:type="dxa" w:w="8640"/>
           </w:tcPr>
           <w:p>
-            <w:r/>
             <w:r>
               <w:br/>
               <w:br/>
@@ -2862,75 +2372,6 @@
           </w:p>
         </w:tc>
       </w:tr>
-      <w:tr>
-        <w:tc>
-          <w:tcPr>
-            <w:tcW w:type="dxa" w:w="4320"/>
-          </w:tcPr>
-          <w:p>
-            <w:r>
-              <w:rPr>
-                <w:b/>
-              </w:rPr>
-              <w:t>Executed by</w:t>
-            </w:r>
-          </w:p>
-        </w:tc>
-        <w:tc>
-          <w:tcPr>
-            <w:tcW w:type="dxa" w:w="4320"/>
-          </w:tcPr>
-          <w:p>
-            <w:r/>
-          </w:p>
-        </w:tc>
-      </w:tr>
-      <w:tr>
-        <w:tc>
-          <w:tcPr>
-            <w:tcW w:type="dxa" w:w="4320"/>
-          </w:tcPr>
-          <w:p>
-            <w:r>
-              <w:rPr>
-                <w:b/>
-              </w:rPr>
-              <w:t>Executed on (date)</w:t>
-            </w:r>
-          </w:p>
-        </w:tc>
-        <w:tc>
-          <w:tcPr>
-            <w:tcW w:type="dxa" w:w="4320"/>
-          </w:tcPr>
-          <w:p>
-            <w:r/>
-          </w:p>
-        </w:tc>
-      </w:tr>
-      <w:tr>
-        <w:tc>
-          <w:tcPr>
-            <w:tcW w:type="dxa" w:w="4320"/>
-          </w:tcPr>
-          <w:p>
-            <w:r>
-              <w:rPr>
-                <w:b/>
-              </w:rPr>
-              <w:t>Evidence reference</w:t>
-            </w:r>
-          </w:p>
-        </w:tc>
-        <w:tc>
-          <w:tcPr>
-            <w:tcW w:type="dxa" w:w="4320"/>
-          </w:tcPr>
-          <w:p>
-            <w:r/>
-          </w:p>
-        </w:tc>
-      </w:tr>
     </w:tbl>
     <w:p/>
     <w:p>
@@ -3028,7 +2469,6 @@
             <w:tcW w:type="dxa" w:w="8640"/>
           </w:tcPr>
           <w:p>
-            <w:r/>
             <w:r>
               <w:br/>
               <w:br/>
@@ -3203,75 +2643,6 @@
           </w:p>
         </w:tc>
       </w:tr>
-      <w:tr>
-        <w:tc>
-          <w:tcPr>
-            <w:tcW w:type="dxa" w:w="4320"/>
-          </w:tcPr>
-          <w:p>
-            <w:r>
-              <w:rPr>
-                <w:b/>
-              </w:rPr>
-              <w:t>Executed by</w:t>
-            </w:r>
-          </w:p>
-        </w:tc>
-        <w:tc>
-          <w:tcPr>
-            <w:tcW w:type="dxa" w:w="4320"/>
-          </w:tcPr>
-          <w:p>
-            <w:r/>
-          </w:p>
-        </w:tc>
-      </w:tr>
-      <w:tr>
-        <w:tc>
-          <w:tcPr>
-            <w:tcW w:type="dxa" w:w="4320"/>
-          </w:tcPr>
-          <w:p>
-            <w:r>
-              <w:rPr>
-                <w:b/>
-              </w:rPr>
-              <w:t>Executed on (date)</w:t>
-            </w:r>
-          </w:p>
-        </w:tc>
-        <w:tc>
-          <w:tcPr>
-            <w:tcW w:type="dxa" w:w="4320"/>
-          </w:tcPr>
-          <w:p>
-            <w:r/>
-          </w:p>
-        </w:tc>
-      </w:tr>
-      <w:tr>
-        <w:tc>
-          <w:tcPr>
-            <w:tcW w:type="dxa" w:w="4320"/>
-          </w:tcPr>
-          <w:p>
-            <w:r>
-              <w:rPr>
-                <w:b/>
-              </w:rPr>
-              <w:t>Evidence reference</w:t>
-            </w:r>
-          </w:p>
-        </w:tc>
-        <w:tc>
-          <w:tcPr>
-            <w:tcW w:type="dxa" w:w="4320"/>
-          </w:tcPr>
-          <w:p>
-            <w:r/>
-          </w:p>
-        </w:tc>
-      </w:tr>
     </w:tbl>
     <w:p/>
     <w:p>
@@ -3369,7 +2740,6 @@
             <w:tcW w:type="dxa" w:w="8640"/>
           </w:tcPr>
           <w:p>
-            <w:r/>
             <w:r>
               <w:br/>
               <w:br/>
@@ -3544,75 +2914,6 @@
           </w:p>
         </w:tc>
       </w:tr>
-      <w:tr>
-        <w:tc>
-          <w:tcPr>
-            <w:tcW w:type="dxa" w:w="4320"/>
-          </w:tcPr>
-          <w:p>
-            <w:r>
-              <w:rPr>
-                <w:b/>
-              </w:rPr>
-              <w:t>Executed by</w:t>
-            </w:r>
-          </w:p>
-        </w:tc>
-        <w:tc>
-          <w:tcPr>
-            <w:tcW w:type="dxa" w:w="4320"/>
-          </w:tcPr>
-          <w:p>
-            <w:r/>
-          </w:p>
-        </w:tc>
-      </w:tr>
-      <w:tr>
-        <w:tc>
-          <w:tcPr>
-            <w:tcW w:type="dxa" w:w="4320"/>
-          </w:tcPr>
-          <w:p>
-            <w:r>
-              <w:rPr>
-                <w:b/>
-              </w:rPr>
-              <w:t>Executed on (date)</w:t>
-            </w:r>
-          </w:p>
-        </w:tc>
-        <w:tc>
-          <w:tcPr>
-            <w:tcW w:type="dxa" w:w="4320"/>
-          </w:tcPr>
-          <w:p>
-            <w:r/>
-          </w:p>
-        </w:tc>
-      </w:tr>
-      <w:tr>
-        <w:tc>
-          <w:tcPr>
-            <w:tcW w:type="dxa" w:w="4320"/>
-          </w:tcPr>
-          <w:p>
-            <w:r>
-              <w:rPr>
-                <w:b/>
-              </w:rPr>
-              <w:t>Evidence reference</w:t>
-            </w:r>
-          </w:p>
-        </w:tc>
-        <w:tc>
-          <w:tcPr>
-            <w:tcW w:type="dxa" w:w="4320"/>
-          </w:tcPr>
-          <w:p>
-            <w:r/>
-          </w:p>
-        </w:tc>
-      </w:tr>
     </w:tbl>
     <w:p/>
     <w:p>
@@ -3726,7 +3027,6 @@
             <w:tcW w:type="dxa" w:w="8640"/>
           </w:tcPr>
           <w:p>
-            <w:r/>
             <w:r>
               <w:br/>
               <w:br/>
@@ -3901,75 +3201,6 @@
           </w:p>
         </w:tc>
       </w:tr>
-      <w:tr>
-        <w:tc>
-          <w:tcPr>
-            <w:tcW w:type="dxa" w:w="4320"/>
-          </w:tcPr>
-          <w:p>
-            <w:r>
-              <w:rPr>
-                <w:b/>
-              </w:rPr>
-              <w:t>Executed by</w:t>
-            </w:r>
-          </w:p>
-        </w:tc>
-        <w:tc>
-          <w:tcPr>
-            <w:tcW w:type="dxa" w:w="4320"/>
-          </w:tcPr>
-          <w:p>
-            <w:r/>
-          </w:p>
-        </w:tc>
-      </w:tr>
-      <w:tr>
-        <w:tc>
-          <w:tcPr>
-            <w:tcW w:type="dxa" w:w="4320"/>
-          </w:tcPr>
-          <w:p>
-            <w:r>
-              <w:rPr>
-                <w:b/>
-              </w:rPr>
-              <w:t>Executed on (date)</w:t>
-            </w:r>
-          </w:p>
-        </w:tc>
-        <w:tc>
-          <w:tcPr>
-            <w:tcW w:type="dxa" w:w="4320"/>
-          </w:tcPr>
-          <w:p>
-            <w:r/>
-          </w:p>
-        </w:tc>
-      </w:tr>
-      <w:tr>
-        <w:tc>
-          <w:tcPr>
-            <w:tcW w:type="dxa" w:w="4320"/>
-          </w:tcPr>
-          <w:p>
-            <w:r>
-              <w:rPr>
-                <w:b/>
-              </w:rPr>
-              <w:t>Evidence reference</w:t>
-            </w:r>
-          </w:p>
-        </w:tc>
-        <w:tc>
-          <w:tcPr>
-            <w:tcW w:type="dxa" w:w="4320"/>
-          </w:tcPr>
-          <w:p>
-            <w:r/>
-          </w:p>
-        </w:tc>
-      </w:tr>
     </w:tbl>
     <w:p/>
     <w:p>
@@ -4067,7 +3298,6 @@
             <w:tcW w:type="dxa" w:w="8640"/>
           </w:tcPr>
           <w:p>
-            <w:r/>
             <w:r>
               <w:br/>
               <w:br/>
@@ -4242,75 +3472,6 @@
           </w:p>
         </w:tc>
       </w:tr>
-      <w:tr>
-        <w:tc>
-          <w:tcPr>
-            <w:tcW w:type="dxa" w:w="4320"/>
-          </w:tcPr>
-          <w:p>
-            <w:r>
-              <w:rPr>
-                <w:b/>
-              </w:rPr>
-              <w:t>Executed by</w:t>
-            </w:r>
-          </w:p>
-        </w:tc>
-        <w:tc>
-          <w:tcPr>
-            <w:tcW w:type="dxa" w:w="4320"/>
-          </w:tcPr>
-          <w:p>
-            <w:r/>
-          </w:p>
-        </w:tc>
-      </w:tr>
-      <w:tr>
-        <w:tc>
-          <w:tcPr>
-            <w:tcW w:type="dxa" w:w="4320"/>
-          </w:tcPr>
-          <w:p>
-            <w:r>
-              <w:rPr>
-                <w:b/>
-              </w:rPr>
-              <w:t>Executed on (date)</w:t>
-            </w:r>
-          </w:p>
-        </w:tc>
-        <w:tc>
-          <w:tcPr>
-            <w:tcW w:type="dxa" w:w="4320"/>
-          </w:tcPr>
-          <w:p>
-            <w:r/>
-          </w:p>
-        </w:tc>
-      </w:tr>
-      <w:tr>
-        <w:tc>
-          <w:tcPr>
-            <w:tcW w:type="dxa" w:w="4320"/>
-          </w:tcPr>
-          <w:p>
-            <w:r>
-              <w:rPr>
-                <w:b/>
-              </w:rPr>
-              <w:t>Evidence reference</w:t>
-            </w:r>
-          </w:p>
-        </w:tc>
-        <w:tc>
-          <w:tcPr>
-            <w:tcW w:type="dxa" w:w="4320"/>
-          </w:tcPr>
-          <w:p>
-            <w:r/>
-          </w:p>
-        </w:tc>
-      </w:tr>
     </w:tbl>
     <w:p/>
     <w:p>
@@ -4408,7 +3569,6 @@
             <w:tcW w:type="dxa" w:w="8640"/>
           </w:tcPr>
           <w:p>
-            <w:r/>
             <w:r>
               <w:br/>
               <w:br/>
@@ -4583,75 +3743,6 @@
           </w:p>
         </w:tc>
       </w:tr>
-      <w:tr>
-        <w:tc>
-          <w:tcPr>
-            <w:tcW w:type="dxa" w:w="4320"/>
-          </w:tcPr>
-          <w:p>
-            <w:r>
-              <w:rPr>
-                <w:b/>
-              </w:rPr>
-              <w:t>Executed by</w:t>
-            </w:r>
-          </w:p>
-        </w:tc>
-        <w:tc>
-          <w:tcPr>
-            <w:tcW w:type="dxa" w:w="4320"/>
-          </w:tcPr>
-          <w:p>
-            <w:r/>
-          </w:p>
-        </w:tc>
-      </w:tr>
-      <w:tr>
-        <w:tc>
-          <w:tcPr>
-            <w:tcW w:type="dxa" w:w="4320"/>
-          </w:tcPr>
-          <w:p>
-            <w:r>
-              <w:rPr>
-                <w:b/>
-              </w:rPr>
-              <w:t>Executed on (date)</w:t>
-            </w:r>
-          </w:p>
-        </w:tc>
-        <w:tc>
-          <w:tcPr>
-            <w:tcW w:type="dxa" w:w="4320"/>
-          </w:tcPr>
-          <w:p>
-            <w:r/>
-          </w:p>
-        </w:tc>
-      </w:tr>
-      <w:tr>
-        <w:tc>
-          <w:tcPr>
-            <w:tcW w:type="dxa" w:w="4320"/>
-          </w:tcPr>
-          <w:p>
-            <w:r>
-              <w:rPr>
-                <w:b/>
-              </w:rPr>
-              <w:t>Evidence reference</w:t>
-            </w:r>
-          </w:p>
-        </w:tc>
-        <w:tc>
-          <w:tcPr>
-            <w:tcW w:type="dxa" w:w="4320"/>
-          </w:tcPr>
-          <w:p>
-            <w:r/>
-          </w:p>
-        </w:tc>
-      </w:tr>
     </w:tbl>
     <w:p/>
     <w:p>
@@ -4749,7 +3840,6 @@
             <w:tcW w:type="dxa" w:w="8640"/>
           </w:tcPr>
           <w:p>
-            <w:r/>
             <w:r>
               <w:br/>
               <w:br/>
@@ -4924,75 +4014,6 @@
           </w:p>
         </w:tc>
       </w:tr>
-      <w:tr>
-        <w:tc>
-          <w:tcPr>
-            <w:tcW w:type="dxa" w:w="4320"/>
-          </w:tcPr>
-          <w:p>
-            <w:r>
-              <w:rPr>
-                <w:b/>
-              </w:rPr>
-              <w:t>Executed by</w:t>
-            </w:r>
-          </w:p>
-        </w:tc>
-        <w:tc>
-          <w:tcPr>
-            <w:tcW w:type="dxa" w:w="4320"/>
-          </w:tcPr>
-          <w:p>
-            <w:r/>
-          </w:p>
-        </w:tc>
-      </w:tr>
-      <w:tr>
-        <w:tc>
-          <w:tcPr>
-            <w:tcW w:type="dxa" w:w="4320"/>
-          </w:tcPr>
-          <w:p>
-            <w:r>
-              <w:rPr>
-                <w:b/>
-              </w:rPr>
-              <w:t>Executed on (date)</w:t>
-            </w:r>
-          </w:p>
-        </w:tc>
-        <w:tc>
-          <w:tcPr>
-            <w:tcW w:type="dxa" w:w="4320"/>
-          </w:tcPr>
-          <w:p>
-            <w:r/>
-          </w:p>
-        </w:tc>
-      </w:tr>
-      <w:tr>
-        <w:tc>
-          <w:tcPr>
-            <w:tcW w:type="dxa" w:w="4320"/>
-          </w:tcPr>
-          <w:p>
-            <w:r>
-              <w:rPr>
-                <w:b/>
-              </w:rPr>
-              <w:t>Evidence reference</w:t>
-            </w:r>
-          </w:p>
-        </w:tc>
-        <w:tc>
-          <w:tcPr>
-            <w:tcW w:type="dxa" w:w="4320"/>
-          </w:tcPr>
-          <w:p>
-            <w:r/>
-          </w:p>
-        </w:tc>
-      </w:tr>
     </w:tbl>
     <w:p/>
     <w:p>
@@ -5090,7 +4111,6 @@
             <w:tcW w:type="dxa" w:w="8640"/>
           </w:tcPr>
           <w:p>
-            <w:r/>
             <w:r>
               <w:br/>
               <w:br/>
@@ -5253,75 +4273,6 @@
                 <w:b/>
               </w:rPr>
               <w:t>Rows returned (count)</w:t>
-            </w:r>
-          </w:p>
-        </w:tc>
-        <w:tc>
-          <w:tcPr>
-            <w:tcW w:type="dxa" w:w="4320"/>
-          </w:tcPr>
-          <w:p>
-            <w:r/>
-          </w:p>
-        </w:tc>
-      </w:tr>
-      <w:tr>
-        <w:tc>
-          <w:tcPr>
-            <w:tcW w:type="dxa" w:w="4320"/>
-          </w:tcPr>
-          <w:p>
-            <w:r>
-              <w:rPr>
-                <w:b/>
-              </w:rPr>
-              <w:t>Executed by</w:t>
-            </w:r>
-          </w:p>
-        </w:tc>
-        <w:tc>
-          <w:tcPr>
-            <w:tcW w:type="dxa" w:w="4320"/>
-          </w:tcPr>
-          <w:p>
-            <w:r/>
-          </w:p>
-        </w:tc>
-      </w:tr>
-      <w:tr>
-        <w:tc>
-          <w:tcPr>
-            <w:tcW w:type="dxa" w:w="4320"/>
-          </w:tcPr>
-          <w:p>
-            <w:r>
-              <w:rPr>
-                <w:b/>
-              </w:rPr>
-              <w:t>Executed on (date)</w:t>
-            </w:r>
-          </w:p>
-        </w:tc>
-        <w:tc>
-          <w:tcPr>
-            <w:tcW w:type="dxa" w:w="4320"/>
-          </w:tcPr>
-          <w:p>
-            <w:r/>
-          </w:p>
-        </w:tc>
-      </w:tr>
-      <w:tr>
-        <w:tc>
-          <w:tcPr>
-            <w:tcW w:type="dxa" w:w="4320"/>
-          </w:tcPr>
-          <w:p>
-            <w:r>
-              <w:rPr>
-                <w:b/>
-              </w:rPr>
-              <w:t>Evidence reference</w:t>
             </w:r>
           </w:p>
         </w:tc>
@@ -5442,7 +4393,6 @@
             <w:tcW w:type="dxa" w:w="8640"/>
           </w:tcPr>
           <w:p>
-            <w:r/>
             <w:r>
               <w:br/>
               <w:br/>
@@ -5605,75 +4555,6 @@
                 <w:b/>
               </w:rPr>
               <w:t>Rows returned (count)</w:t>
-            </w:r>
-          </w:p>
-        </w:tc>
-        <w:tc>
-          <w:tcPr>
-            <w:tcW w:type="dxa" w:w="4320"/>
-          </w:tcPr>
-          <w:p>
-            <w:r/>
-          </w:p>
-        </w:tc>
-      </w:tr>
-      <w:tr>
-        <w:tc>
-          <w:tcPr>
-            <w:tcW w:type="dxa" w:w="4320"/>
-          </w:tcPr>
-          <w:p>
-            <w:r>
-              <w:rPr>
-                <w:b/>
-              </w:rPr>
-              <w:t>Executed by</w:t>
-            </w:r>
-          </w:p>
-        </w:tc>
-        <w:tc>
-          <w:tcPr>
-            <w:tcW w:type="dxa" w:w="4320"/>
-          </w:tcPr>
-          <w:p>
-            <w:r/>
-          </w:p>
-        </w:tc>
-      </w:tr>
-      <w:tr>
-        <w:tc>
-          <w:tcPr>
-            <w:tcW w:type="dxa" w:w="4320"/>
-          </w:tcPr>
-          <w:p>
-            <w:r>
-              <w:rPr>
-                <w:b/>
-              </w:rPr>
-              <w:t>Executed on (date)</w:t>
-            </w:r>
-          </w:p>
-        </w:tc>
-        <w:tc>
-          <w:tcPr>
-            <w:tcW w:type="dxa" w:w="4320"/>
-          </w:tcPr>
-          <w:p>
-            <w:r/>
-          </w:p>
-        </w:tc>
-      </w:tr>
-      <w:tr>
-        <w:tc>
-          <w:tcPr>
-            <w:tcW w:type="dxa" w:w="4320"/>
-          </w:tcPr>
-          <w:p>
-            <w:r>
-              <w:rPr>
-                <w:b/>
-              </w:rPr>
-              <w:t>Evidence reference</w:t>
             </w:r>
           </w:p>
         </w:tc>
@@ -5834,7 +4715,6 @@
             <w:tcW w:type="dxa" w:w="8640"/>
           </w:tcPr>
           <w:p>
-            <w:r/>
             <w:r>
               <w:br/>
               <w:br/>
@@ -5997,75 +4877,6 @@
                 <w:b/>
               </w:rPr>
               <w:t>Rows returned (count)</w:t>
-            </w:r>
-          </w:p>
-        </w:tc>
-        <w:tc>
-          <w:tcPr>
-            <w:tcW w:type="dxa" w:w="4320"/>
-          </w:tcPr>
-          <w:p>
-            <w:r/>
-          </w:p>
-        </w:tc>
-      </w:tr>
-      <w:tr>
-        <w:tc>
-          <w:tcPr>
-            <w:tcW w:type="dxa" w:w="4320"/>
-          </w:tcPr>
-          <w:p>
-            <w:r>
-              <w:rPr>
-                <w:b/>
-              </w:rPr>
-              <w:t>Executed by</w:t>
-            </w:r>
-          </w:p>
-        </w:tc>
-        <w:tc>
-          <w:tcPr>
-            <w:tcW w:type="dxa" w:w="4320"/>
-          </w:tcPr>
-          <w:p>
-            <w:r/>
-          </w:p>
-        </w:tc>
-      </w:tr>
-      <w:tr>
-        <w:tc>
-          <w:tcPr>
-            <w:tcW w:type="dxa" w:w="4320"/>
-          </w:tcPr>
-          <w:p>
-            <w:r>
-              <w:rPr>
-                <w:b/>
-              </w:rPr>
-              <w:t>Executed on (date)</w:t>
-            </w:r>
-          </w:p>
-        </w:tc>
-        <w:tc>
-          <w:tcPr>
-            <w:tcW w:type="dxa" w:w="4320"/>
-          </w:tcPr>
-          <w:p>
-            <w:r/>
-          </w:p>
-        </w:tc>
-      </w:tr>
-      <w:tr>
-        <w:tc>
-          <w:tcPr>
-            <w:tcW w:type="dxa" w:w="4320"/>
-          </w:tcPr>
-          <w:p>
-            <w:r>
-              <w:rPr>
-                <w:b/>
-              </w:rPr>
-              <w:t>Evidence reference</w:t>
             </w:r>
           </w:p>
         </w:tc>
@@ -6226,7 +5037,6 @@
             <w:tcW w:type="dxa" w:w="8640"/>
           </w:tcPr>
           <w:p>
-            <w:r/>
             <w:r>
               <w:br/>
               <w:br/>
@@ -6389,75 +5199,6 @@
                 <w:b/>
               </w:rPr>
               <w:t>Rows returned (count)</w:t>
-            </w:r>
-          </w:p>
-        </w:tc>
-        <w:tc>
-          <w:tcPr>
-            <w:tcW w:type="dxa" w:w="4320"/>
-          </w:tcPr>
-          <w:p>
-            <w:r/>
-          </w:p>
-        </w:tc>
-      </w:tr>
-      <w:tr>
-        <w:tc>
-          <w:tcPr>
-            <w:tcW w:type="dxa" w:w="4320"/>
-          </w:tcPr>
-          <w:p>
-            <w:r>
-              <w:rPr>
-                <w:b/>
-              </w:rPr>
-              <w:t>Executed by</w:t>
-            </w:r>
-          </w:p>
-        </w:tc>
-        <w:tc>
-          <w:tcPr>
-            <w:tcW w:type="dxa" w:w="4320"/>
-          </w:tcPr>
-          <w:p>
-            <w:r/>
-          </w:p>
-        </w:tc>
-      </w:tr>
-      <w:tr>
-        <w:tc>
-          <w:tcPr>
-            <w:tcW w:type="dxa" w:w="4320"/>
-          </w:tcPr>
-          <w:p>
-            <w:r>
-              <w:rPr>
-                <w:b/>
-              </w:rPr>
-              <w:t>Executed on (date)</w:t>
-            </w:r>
-          </w:p>
-        </w:tc>
-        <w:tc>
-          <w:tcPr>
-            <w:tcW w:type="dxa" w:w="4320"/>
-          </w:tcPr>
-          <w:p>
-            <w:r/>
-          </w:p>
-        </w:tc>
-      </w:tr>
-      <w:tr>
-        <w:tc>
-          <w:tcPr>
-            <w:tcW w:type="dxa" w:w="4320"/>
-          </w:tcPr>
-          <w:p>
-            <w:r>
-              <w:rPr>
-                <w:b/>
-              </w:rPr>
-              <w:t>Evidence reference</w:t>
             </w:r>
           </w:p>
         </w:tc>
@@ -6534,7 +5275,6 @@
             <w:tcW w:type="dxa" w:w="8640"/>
           </w:tcPr>
           <w:p>
-            <w:r/>
             <w:r>
               <w:br/>
               <w:br/>
@@ -6709,75 +5449,6 @@
           </w:p>
         </w:tc>
       </w:tr>
-      <w:tr>
-        <w:tc>
-          <w:tcPr>
-            <w:tcW w:type="dxa" w:w="4320"/>
-          </w:tcPr>
-          <w:p>
-            <w:r>
-              <w:rPr>
-                <w:b/>
-              </w:rPr>
-              <w:t>Executed by</w:t>
-            </w:r>
-          </w:p>
-        </w:tc>
-        <w:tc>
-          <w:tcPr>
-            <w:tcW w:type="dxa" w:w="4320"/>
-          </w:tcPr>
-          <w:p>
-            <w:r/>
-          </w:p>
-        </w:tc>
-      </w:tr>
-      <w:tr>
-        <w:tc>
-          <w:tcPr>
-            <w:tcW w:type="dxa" w:w="4320"/>
-          </w:tcPr>
-          <w:p>
-            <w:r>
-              <w:rPr>
-                <w:b/>
-              </w:rPr>
-              <w:t>Executed on (date)</w:t>
-            </w:r>
-          </w:p>
-        </w:tc>
-        <w:tc>
-          <w:tcPr>
-            <w:tcW w:type="dxa" w:w="4320"/>
-          </w:tcPr>
-          <w:p>
-            <w:r/>
-          </w:p>
-        </w:tc>
-      </w:tr>
-      <w:tr>
-        <w:tc>
-          <w:tcPr>
-            <w:tcW w:type="dxa" w:w="4320"/>
-          </w:tcPr>
-          <w:p>
-            <w:r>
-              <w:rPr>
-                <w:b/>
-              </w:rPr>
-              <w:t>Evidence reference</w:t>
-            </w:r>
-          </w:p>
-        </w:tc>
-        <w:tc>
-          <w:tcPr>
-            <w:tcW w:type="dxa" w:w="4320"/>
-          </w:tcPr>
-          <w:p>
-            <w:r/>
-          </w:p>
-        </w:tc>
-      </w:tr>
     </w:tbl>
     <w:p/>
     <w:p>
@@ -6875,7 +5546,6 @@
             <w:tcW w:type="dxa" w:w="8640"/>
           </w:tcPr>
           <w:p>
-            <w:r/>
             <w:r>
               <w:br/>
               <w:br/>

</xml_diff>